<commit_message>
actualizacion final del informe
</commit_message>
<xml_diff>
--- a/captura imagenes.docx
+++ b/captura imagenes.docx
@@ -50,6 +50,7 @@
       </w:pPr>
       <w:r>
         <w:rPr>
+          <w:noProof/>
           <w:lang w:val="es-ES"/>
         </w:rPr>
         <w:drawing>
@@ -123,6 +124,7 @@
       </w:pPr>
       <w:r>
         <w:rPr>
+          <w:noProof/>
           <w:lang w:val="es-ES"/>
         </w:rPr>
         <w:drawing>
@@ -193,19 +195,7 @@
         <w:rPr>
           <w:lang w:val="es-ES"/>
         </w:rPr>
-        <w:t xml:space="preserve"> y fundamental a </w:t>
-      </w:r>
-      <w:r>
-        <w:rPr>
-          <w:lang w:val="es-ES"/>
-        </w:rPr>
-        <w:t>6</w:t>
-      </w:r>
-      <w:r>
-        <w:rPr>
-          <w:lang w:val="es-ES"/>
-        </w:rPr>
-        <w:t>00hz</w:t>
+        <w:t xml:space="preserve"> y fundamental a 600hz</w:t>
       </w:r>
       <w:r>
         <w:rPr>
@@ -222,6 +212,7 @@
       </w:pPr>
       <w:r>
         <w:rPr>
+          <w:noProof/>
           <w:lang w:val="es-ES"/>
         </w:rPr>
         <w:lastRenderedPageBreak/>
@@ -270,6 +261,7 @@
       </w:pPr>
       <w:r>
         <w:rPr>
+          <w:noProof/>
           <w:lang w:val="es-ES"/>
         </w:rPr>
         <w:drawing>
@@ -317,6 +309,7 @@
       </w:pPr>
       <w:r>
         <w:rPr>
+          <w:noProof/>
           <w:lang w:val="es-ES"/>
         </w:rPr>
         <w:lastRenderedPageBreak/>
@@ -418,6 +411,7 @@
       </w:pPr>
       <w:r>
         <w:rPr>
+          <w:noProof/>
           <w:lang w:val="es-ES"/>
         </w:rPr>
         <w:drawing>
@@ -491,6 +485,7 @@
       </w:pPr>
       <w:r>
         <w:rPr>
+          <w:noProof/>
           <w:lang w:val="es-ES"/>
         </w:rPr>
         <w:drawing>
@@ -551,6 +546,7 @@
       </w:pPr>
       <w:r>
         <w:rPr>
+          <w:noProof/>
           <w:lang w:val="es-ES"/>
         </w:rPr>
         <w:lastRenderedPageBreak/>
@@ -632,6 +628,7 @@
       </w:pPr>
       <w:r>
         <w:rPr>
+          <w:noProof/>
           <w:lang w:val="es-ES"/>
         </w:rPr>
         <w:drawing>
@@ -705,6 +702,7 @@
       </w:pPr>
       <w:r>
         <w:rPr>
+          <w:noProof/>
           <w:lang w:val="es-ES"/>
         </w:rPr>
         <w:drawing>
@@ -752,6 +750,7 @@
       </w:pPr>
       <w:r>
         <w:rPr>
+          <w:noProof/>
           <w:lang w:val="es-ES"/>
         </w:rPr>
         <w:lastRenderedPageBreak/>
@@ -813,6 +812,7 @@
       </w:pPr>
       <w:r>
         <w:rPr>
+          <w:noProof/>
           <w:lang w:val="es-ES"/>
         </w:rPr>
         <w:drawing>
@@ -873,6 +873,7 @@
       </w:pPr>
       <w:r>
         <w:rPr>
+          <w:noProof/>
           <w:lang w:val="es-ES"/>
         </w:rPr>
         <w:lastRenderedPageBreak/>
@@ -947,6 +948,7 @@
       </w:pPr>
       <w:r>
         <w:rPr>
+          <w:noProof/>
           <w:lang w:val="es-ES"/>
         </w:rPr>
         <w:drawing>
@@ -1034,6 +1036,7 @@
       </w:pPr>
       <w:r>
         <w:rPr>
+          <w:noProof/>
           <w:lang w:val="es-ES"/>
         </w:rPr>
         <w:drawing>
@@ -1165,6 +1168,7 @@
       </w:r>
       <w:r>
         <w:rPr>
+          <w:noProof/>
           <w:lang w:val="es-ES"/>
         </w:rPr>
         <w:drawing>
@@ -1232,6 +1236,7 @@
       </w:pPr>
       <w:r>
         <w:rPr>
+          <w:noProof/>
           <w:lang w:val="es-ES"/>
         </w:rPr>
         <w:drawing>
@@ -1292,6 +1297,7 @@
       </w:pPr>
       <w:r>
         <w:rPr>
+          <w:noProof/>
           <w:lang w:val="es-ES"/>
         </w:rPr>
         <w:lastRenderedPageBreak/>
@@ -1366,6 +1372,7 @@
       </w:pPr>
       <w:r>
         <w:rPr>
+          <w:noProof/>
           <w:lang w:val="es-ES"/>
         </w:rPr>
         <w:drawing>
@@ -1426,6 +1433,7 @@
       </w:pPr>
       <w:r>
         <w:rPr>
+          <w:noProof/>
           <w:lang w:val="es-ES"/>
         </w:rPr>
         <w:drawing>
@@ -1487,6 +1495,7 @@
       </w:pPr>
       <w:r>
         <w:rPr>
+          <w:noProof/>
           <w:lang w:val="es-ES"/>
         </w:rPr>
         <w:drawing>
@@ -1534,6 +1543,7 @@
       </w:pPr>
       <w:r>
         <w:rPr>
+          <w:noProof/>
           <w:lang w:val="es-ES"/>
         </w:rPr>
         <w:drawing>
@@ -1581,6 +1591,7 @@
       </w:pPr>
       <w:r>
         <w:rPr>
+          <w:noProof/>
           <w:lang w:val="es-ES"/>
         </w:rPr>
         <w:lastRenderedPageBreak/>
@@ -1609,6 +1620,103 @@
                     <a:xfrm>
                       <a:off x="0" y="0"/>
                       <a:ext cx="5400040" cy="4156710"/>
+                    </a:xfrm>
+                    <a:prstGeom prst="rect">
+                      <a:avLst/>
+                    </a:prstGeom>
+                  </pic:spPr>
+                </pic:pic>
+              </a:graphicData>
+            </a:graphic>
+          </wp:inline>
+        </w:drawing>
+      </w:r>
+    </w:p>
+    <w:p>
+      <w:pPr>
+        <w:rPr>
+          <w:lang w:val="es-ES"/>
+        </w:rPr>
+      </w:pPr>
+      <w:r>
+        <w:rPr>
+          <w:noProof/>
+          <w:lang w:eastAsia="es-AR"/>
+        </w:rPr>
+        <w:drawing>
+          <wp:inline distT="0" distB="0" distL="0" distR="0" wp14:anchorId="684FFA8C" wp14:editId="038865DA">
+            <wp:extent cx="5400040" cy="2051135"/>
+            <wp:effectExtent l="0" t="0" r="0" b="6350"/>
+            <wp:docPr id="263571844" name="Imagen 1"/>
+            <wp:cNvGraphicFramePr>
+              <a:graphicFrameLocks xmlns:a="http://schemas.openxmlformats.org/drawingml/2006/main" noChangeAspect="1"/>
+            </wp:cNvGraphicFramePr>
+            <a:graphic xmlns:a="http://schemas.openxmlformats.org/drawingml/2006/main">
+              <a:graphicData uri="http://schemas.openxmlformats.org/drawingml/2006/picture">
+                <pic:pic xmlns:pic="http://schemas.openxmlformats.org/drawingml/2006/picture">
+                  <pic:nvPicPr>
+                    <pic:cNvPr id="263571844" name=""/>
+                    <pic:cNvPicPr/>
+                  </pic:nvPicPr>
+                  <pic:blipFill>
+                    <a:blip r:embed="rId27"/>
+                    <a:stretch>
+                      <a:fillRect/>
+                    </a:stretch>
+                  </pic:blipFill>
+                  <pic:spPr>
+                    <a:xfrm>
+                      <a:off x="0" y="0"/>
+                      <a:ext cx="5400040" cy="2051135"/>
+                    </a:xfrm>
+                    <a:prstGeom prst="rect">
+                      <a:avLst/>
+                    </a:prstGeom>
+                  </pic:spPr>
+                </pic:pic>
+              </a:graphicData>
+            </a:graphic>
+          </wp:inline>
+        </w:drawing>
+      </w:r>
+    </w:p>
+    <w:p>
+      <w:pPr>
+        <w:rPr>
+          <w:lang w:val="es-ES"/>
+        </w:rPr>
+      </w:pPr>
+      <w:r>
+        <w:rPr>
+          <w:rFonts w:cs="Arial"/>
+          <w:noProof/>
+        </w:rPr>
+        <w:lastRenderedPageBreak/>
+        <w:drawing>
+          <wp:inline distT="0" distB="0" distL="0" distR="0" wp14:anchorId="53DC5B5C" wp14:editId="47A9C37F">
+            <wp:extent cx="4391638" cy="6658904"/>
+            <wp:effectExtent l="0" t="0" r="9525" b="8890"/>
+            <wp:docPr id="1763393765" name="Imagen 1"/>
+            <wp:cNvGraphicFramePr>
+              <a:graphicFrameLocks xmlns:a="http://schemas.openxmlformats.org/drawingml/2006/main" noChangeAspect="1"/>
+            </wp:cNvGraphicFramePr>
+            <a:graphic xmlns:a="http://schemas.openxmlformats.org/drawingml/2006/main">
+              <a:graphicData uri="http://schemas.openxmlformats.org/drawingml/2006/picture">
+                <pic:pic xmlns:pic="http://schemas.openxmlformats.org/drawingml/2006/picture">
+                  <pic:nvPicPr>
+                    <pic:cNvPr id="1763393765" name=""/>
+                    <pic:cNvPicPr/>
+                  </pic:nvPicPr>
+                  <pic:blipFill>
+                    <a:blip r:embed="rId28"/>
+                    <a:stretch>
+                      <a:fillRect/>
+                    </a:stretch>
+                  </pic:blipFill>
+                  <pic:spPr>
+                    <a:xfrm>
+                      <a:off x="0" y="0"/>
+                      <a:ext cx="4391638" cy="6658904"/>
                     </a:xfrm>
                     <a:prstGeom prst="rect">
                       <a:avLst/>

</xml_diff>